<commit_message>
docs: remove personal note and refine architectural preface
</commit_message>
<xml_diff>
--- a/docs/Ellie_v5_Architecture_Specification.docx
+++ b/docs/Ellie_v5_Architecture_Specification.docx
@@ -145,7 +145,7 @@
           <w:sz w:val="22"/>
           <w:szCs w:val="22"/>
         </w:rPr>
-        <w:t xml:space="preserve">This architecture specification documents Ellie v5, a private, single-tenant, Slack-first AI Chief of Staff. The system was designed and built following production experience with commercial AI coworker platforms, specifically Viktor.com (where the author is an active participant in the Viktor Implementation Specialist program).</w:t>
+        <w:t xml:space="preserve">This architecture specification documents Ellie v5, a private, single-tenant, Slack-first AI Chief of Staff. The system was designed and built following production experience with commercial AI coworker platforms (specifically Viktor.com).</w:t>
       </w:r>
     </w:p>
     <w:p>
@@ -163,7 +163,7 @@
           <w:sz w:val="22"/>
           <w:szCs w:val="22"/>
         </w:rPr>
-        <w:t xml:space="preserve">Viktor is great and excels for mid-size and enterprise companies, where pooled team budgets absorb usage-based consumption naturally. That is why it is an ideal platform to pitch and implement for corporate clients. Viktor pioneered several interaction patterns that heavily inspired Ellie:</w:t>
+        <w:t xml:space="preserve">Commercial AI coworker platforms excel for mid-size and enterprise companies, where pooled team budgets absorb usage-based consumption naturally. Such platforms pioneered several interaction patterns that heavily inspired Ellie:</w:t>
       </w:r>
     </w:p>
     <w:p>
@@ -288,7 +288,7 @@
           <w:sz w:val="26"/>
           <w:szCs w:val="26"/>
         </w:rPr>
-        <w:t xml:space="preserve">The Freelancer Dilemma &amp; Real-World Friction</w:t>
+        <w:t xml:space="preserve">The Solo Operator Dilemma &amp; Real-World Friction</w:t>
       </w:r>
     </w:p>
     <w:p>
@@ -396,7 +396,7 @@
           <w:sz w:val="22"/>
           <w:szCs w:val="22"/>
         </w:rPr>
-        <w:t xml:space="preserve">Viktor's workflow was too good to drop, but running it continuously as an independent operator required a setup anchored in direct-API pricing and deterministic host-code execution:</w:t>
+        <w:t xml:space="preserve">While the coworker workflow is compelling, running it continuously as an independent operator required a setup anchored in direct-API pricing and deterministic host-code execution:</w:t>
       </w:r>
     </w:p>
     <w:p>

</xml_diff>

<commit_message>
fix: harden showcase security and documentation
</commit_message>
<xml_diff>
--- a/docs/Ellie_v5_Architecture_Specification.docx
+++ b/docs/Ellie_v5_Architecture_Specification.docx
@@ -91,6 +91,62 @@
         </w:tc>
       </w:tr>
     </w:tbl>
+    <w:tbl>
+      <w:tblPr>
+        <w:tblW w:type="pct" w:w="100%"/>
+        <w:tblBorders>
+          <w:top w:val="none"/>
+          <w:left w:val="single" w:color="1A73E8" w:sz="24"/>
+          <w:bottom w:val="none"/>
+          <w:right w:val="none"/>
+          <w:insideH w:val="single" w:color="auto" w:sz="4"/>
+          <w:insideV w:val="single" w:color="auto" w:sz="4"/>
+        </w:tblBorders>
+      </w:tblPr>
+      <w:tblGrid>
+        <w:gridCol w:w="100"/>
+      </w:tblGrid>
+      <w:tr>
+        <w:tc>
+          <w:tcPr>
+            <w:shd w:fill="E8F0FE" w:val="clear"/>
+            <w:tcMar>
+              <w:top w:type="dxa" w:w="140"/>
+              <w:left w:type="dxa" w:w="180"/>
+              <w:bottom w:type="dxa" w:w="140"/>
+              <w:right w:type="dxa" w:w="180"/>
+            </w:tcMar>
+          </w:tcPr>
+          <w:p>
+            <w:pPr>
+              <w:spacing w:line="280"/>
+            </w:pPr>
+            <w:r>
+              <w:rPr>
+                <w:rFonts w:ascii="Google Sans Text" w:cs="Google Sans Text" w:eastAsia="Google Sans Text" w:hAnsi="Google Sans Text"/>
+                <w:b/>
+                <w:bCs/>
+                <w:color w:val="174EA6"/>
+                <w:sz w:val="22"/>
+                <w:szCs w:val="22"/>
+              </w:rPr>
+              <w:t xml:space="preserve">Scope: </w:t>
+            </w:r>
+            <w:r>
+              <w:rPr>
+                <w:rFonts w:ascii="Google Sans Text" w:cs="Google Sans Text" w:eastAsia="Google Sans Text" w:hAnsi="Google Sans Text"/>
+                <w:i/>
+                <w:iCs/>
+                <w:color w:val="202124"/>
+                <w:sz w:val="22"/>
+                <w:szCs w:val="22"/>
+              </w:rPr>
+              <w:t xml:space="preserve">This document describes an implementation showcase, not a supported hosted service or production deployment contract. Task content is processed by configured external providers.</w:t>
+            </w:r>
+          </w:p>
+        </w:tc>
+      </w:tr>
+    </w:tbl>
     <w:p>
       <w:pPr>
         <w:spacing w:after="200"/>
@@ -468,7 +524,7 @@
           <w:sz w:val="22"/>
           <w:szCs w:val="22"/>
         </w:rPr>
-        <w:t xml:space="preserve">System prompts like "do not send emails without permission" fail under prompt injection, context truncation, or subtle conversational pressure. Host code keeps absolute authority. Native tools belong to static effect classes (READ, LOCAL_WRITE, INTERNAL_REVERSIBLE_WRITE, CONSEQUENTIAL). Consequential tools (sending emails, staging external payments, creating public calendar entries) cannot execute directly. The dispatcher intercepts the call, logs it in an append-only SQLite ledger, and renders a cryptographic Slack approval card. Only an explicit human click triggers execution.</w:t>
+        <w:t xml:space="preserve">System prompts like "do not send emails without permission" fail under prompt injection, context truncation, or subtle conversational pressure. Host code keeps the authority boundary. Native tools belong to effect classes (READ, LOCAL_WRITE, INTERNAL_REVERSIBLE_WRITE, CONSEQUENTIAL). Consequential tools cannot execute directly. The dispatcher records a proposal in SQLite and appends its state transitions to an event history before rendering the full serialized payload in a Slack approval card. Only an explicit owner interaction with a valid Slack signature triggers execution.</w:t>
       </w:r>
     </w:p>
     <w:p>
@@ -2713,7 +2769,7 @@
           <w:sz w:val="22"/>
           <w:szCs w:val="22"/>
         </w:rPr>
-        <w:t xml:space="preserve">If the tool is classified as INTERNAL_REVERSIBLE_WRITE, the operation executes immediately and runs an automated read-back verification pass.</w:t>
+        <w:t xml:space="preserve">If the tool is classified as INTERNAL_REVERSIBLE_WRITE, the operation executes immediately and runs a tool-specific read-back check where one is implemented.</w:t>
       </w:r>
     </w:p>
     <w:p>
@@ -2730,7 +2786,7 @@
           <w:sz w:val="34"/>
           <w:szCs w:val="34"/>
         </w:rPr>
-        <w:t xml:space="preserve">3. Complete Tool Catalog Inventory (74 Native Tools)</w:t>
+        <w:t xml:space="preserve">3. Tool Catalog Inventory</w:t>
       </w:r>
     </w:p>
     <w:p>
@@ -2748,7 +2804,7 @@
           <w:sz w:val="22"/>
           <w:szCs w:val="22"/>
         </w:rPr>
-        <w:t xml:space="preserve">All 74 native tools are statically typed, assigned an effect class, and guarded by host code before invocation.</w:t>
+        <w:t xml:space="preserve">Native and dynamically registered tools are typed, assigned an effect class, and passed through host-code checks before invocation.</w:t>
       </w:r>
     </w:p>
     <w:p>
@@ -4589,7 +4645,7 @@
           <w:sz w:val="22"/>
           <w:szCs w:val="22"/>
         </w:rPr>
-        <w:t xml:space="preserve">When a routine has hard factual constraints, a second evaluator pass checks the draft against tool evidence using the reasoning model before anything posts to Slack.</w:t>
+        <w:t xml:space="preserve">When a routine has hard factual constraints, an optional evaluator pass checks the draft against tool evidence using the reasoning model and appends a note when a violation is detected.</w:t>
       </w:r>
     </w:p>
     <w:p>
@@ -4624,7 +4680,7 @@
           <w:sz w:val="22"/>
           <w:szCs w:val="22"/>
         </w:rPr>
-        <w:t xml:space="preserve">A single-page control plane runs alongside the agent runtime under token authentication.</w:t>
+        <w:t xml:space="preserve">A single-page control plane runs alongside the agent runtime under token authentication or a configured trusted tailnet listener.</w:t>
       </w:r>
     </w:p>
     <w:p>
@@ -4642,7 +4698,7 @@
           <w:sz w:val="22"/>
           <w:szCs w:val="22"/>
         </w:rPr>
-        <w:t xml:space="preserve">The approvals screen (at /) lists staged consequential actions with diff previews, approval buttons, and drop controls. A spaces gallery (at /spaces) lets users browse and search agent-published dashboards and micro-apps. The routines screen manages schedules and manual run triggers, while the runs tab provides glass-box telemetry for prompt timing, token counts, cache hit rates, and delivered text. Additional views report token costs, project documentation, and integration health checks.</w:t>
+        <w:t xml:space="preserve">The approvals screen (at /) lists staged consequential actions with payload previews, approval buttons, and drop controls. A spaces gallery (at /spaces) lets users browse and search agent-published dashboards and micro-apps. The routines screen manages schedules and manual run triggers, while the runs tab provides glass-box telemetry for prompt timing, token counts, cache hit rates, and delivered text. Additional views report token costs, project documentation, and integration health checks.</w:t>
       </w:r>
     </w:p>
     <w:p>
@@ -4676,7 +4732,7 @@
           <w:sz w:val="26"/>
           <w:szCs w:val="26"/>
         </w:rPr>
-        <w:t xml:space="preserve">Current Production State (v5.0.0)</w:t>
+        <w:t xml:space="preserve">Showcase Implementation (v5.0.0)</w:t>
       </w:r>
     </w:p>
     <w:p>
@@ -4694,7 +4750,7 @@
           <w:sz w:val="22"/>
           <w:szCs w:val="22"/>
         </w:rPr>
-        <w:t xml:space="preserve">The core agent, deterministic governance pipeline, dual-engine document rendering (DOCX and visual HTML/SVG PDFs), and all 74 native tools are in production, backed by 44 test suites with 390 passing unit and integration tests.</w:t>
+        <w:t xml:space="preserve">The showcase includes the core agent, governance pipeline, dual-engine document rendering, native integrations, dynamically registered integrations, and an automated offline test suite.</w:t>
       </w:r>
     </w:p>
     <w:p>

</xml_diff>

<commit_message>
fix: harden showcase security and documentation (#1)
</commit_message>
<xml_diff>
--- a/docs/Ellie_v5_Architecture_Specification.docx
+++ b/docs/Ellie_v5_Architecture_Specification.docx
@@ -91,6 +91,62 @@
         </w:tc>
       </w:tr>
     </w:tbl>
+    <w:tbl>
+      <w:tblPr>
+        <w:tblW w:type="pct" w:w="100%"/>
+        <w:tblBorders>
+          <w:top w:val="none"/>
+          <w:left w:val="single" w:color="1A73E8" w:sz="24"/>
+          <w:bottom w:val="none"/>
+          <w:right w:val="none"/>
+          <w:insideH w:val="single" w:color="auto" w:sz="4"/>
+          <w:insideV w:val="single" w:color="auto" w:sz="4"/>
+        </w:tblBorders>
+      </w:tblPr>
+      <w:tblGrid>
+        <w:gridCol w:w="100"/>
+      </w:tblGrid>
+      <w:tr>
+        <w:tc>
+          <w:tcPr>
+            <w:shd w:fill="E8F0FE" w:val="clear"/>
+            <w:tcMar>
+              <w:top w:type="dxa" w:w="140"/>
+              <w:left w:type="dxa" w:w="180"/>
+              <w:bottom w:type="dxa" w:w="140"/>
+              <w:right w:type="dxa" w:w="180"/>
+            </w:tcMar>
+          </w:tcPr>
+          <w:p>
+            <w:pPr>
+              <w:spacing w:line="280"/>
+            </w:pPr>
+            <w:r>
+              <w:rPr>
+                <w:rFonts w:ascii="Google Sans Text" w:cs="Google Sans Text" w:eastAsia="Google Sans Text" w:hAnsi="Google Sans Text"/>
+                <w:b/>
+                <w:bCs/>
+                <w:color w:val="174EA6"/>
+                <w:sz w:val="22"/>
+                <w:szCs w:val="22"/>
+              </w:rPr>
+              <w:t xml:space="preserve">Scope: </w:t>
+            </w:r>
+            <w:r>
+              <w:rPr>
+                <w:rFonts w:ascii="Google Sans Text" w:cs="Google Sans Text" w:eastAsia="Google Sans Text" w:hAnsi="Google Sans Text"/>
+                <w:i/>
+                <w:iCs/>
+                <w:color w:val="202124"/>
+                <w:sz w:val="22"/>
+                <w:szCs w:val="22"/>
+              </w:rPr>
+              <w:t xml:space="preserve">This document describes an implementation showcase, not a supported hosted service or production deployment contract. Task content is processed by configured external providers.</w:t>
+            </w:r>
+          </w:p>
+        </w:tc>
+      </w:tr>
+    </w:tbl>
     <w:p>
       <w:pPr>
         <w:spacing w:after="200"/>
@@ -468,7 +524,7 @@
           <w:sz w:val="22"/>
           <w:szCs w:val="22"/>
         </w:rPr>
-        <w:t xml:space="preserve">System prompts like "do not send emails without permission" fail under prompt injection, context truncation, or subtle conversational pressure. Host code keeps absolute authority. Native tools belong to static effect classes (READ, LOCAL_WRITE, INTERNAL_REVERSIBLE_WRITE, CONSEQUENTIAL). Consequential tools (sending emails, staging external payments, creating public calendar entries) cannot execute directly. The dispatcher intercepts the call, logs it in an append-only SQLite ledger, and renders a cryptographic Slack approval card. Only an explicit human click triggers execution.</w:t>
+        <w:t xml:space="preserve">System prompts like "do not send emails without permission" fail under prompt injection, context truncation, or subtle conversational pressure. Host code keeps the authority boundary. Native tools belong to effect classes (READ, LOCAL_WRITE, INTERNAL_REVERSIBLE_WRITE, CONSEQUENTIAL). Consequential tools cannot execute directly. The dispatcher records a proposal in SQLite and appends its state transitions to an event history before rendering the full serialized payload in a Slack approval card. Only an explicit owner interaction with a valid Slack signature triggers execution.</w:t>
       </w:r>
     </w:p>
     <w:p>
@@ -2713,7 +2769,7 @@
           <w:sz w:val="22"/>
           <w:szCs w:val="22"/>
         </w:rPr>
-        <w:t xml:space="preserve">If the tool is classified as INTERNAL_REVERSIBLE_WRITE, the operation executes immediately and runs an automated read-back verification pass.</w:t>
+        <w:t xml:space="preserve">If the tool is classified as INTERNAL_REVERSIBLE_WRITE, the operation executes immediately and runs a tool-specific read-back check where one is implemented.</w:t>
       </w:r>
     </w:p>
     <w:p>
@@ -2730,7 +2786,7 @@
           <w:sz w:val="34"/>
           <w:szCs w:val="34"/>
         </w:rPr>
-        <w:t xml:space="preserve">3. Complete Tool Catalog Inventory (74 Native Tools)</w:t>
+        <w:t xml:space="preserve">3. Tool Catalog Inventory</w:t>
       </w:r>
     </w:p>
     <w:p>
@@ -2748,7 +2804,7 @@
           <w:sz w:val="22"/>
           <w:szCs w:val="22"/>
         </w:rPr>
-        <w:t xml:space="preserve">All 74 native tools are statically typed, assigned an effect class, and guarded by host code before invocation.</w:t>
+        <w:t xml:space="preserve">Native and dynamically registered tools are typed, assigned an effect class, and passed through host-code checks before invocation.</w:t>
       </w:r>
     </w:p>
     <w:p>
@@ -4589,7 +4645,7 @@
           <w:sz w:val="22"/>
           <w:szCs w:val="22"/>
         </w:rPr>
-        <w:t xml:space="preserve">When a routine has hard factual constraints, a second evaluator pass checks the draft against tool evidence using the reasoning model before anything posts to Slack.</w:t>
+        <w:t xml:space="preserve">When a routine has hard factual constraints, an optional evaluator pass checks the draft against tool evidence using the reasoning model and appends a note when a violation is detected.</w:t>
       </w:r>
     </w:p>
     <w:p>
@@ -4624,7 +4680,7 @@
           <w:sz w:val="22"/>
           <w:szCs w:val="22"/>
         </w:rPr>
-        <w:t xml:space="preserve">A single-page control plane runs alongside the agent runtime under token authentication.</w:t>
+        <w:t xml:space="preserve">A single-page control plane runs alongside the agent runtime under token authentication or a configured trusted tailnet listener.</w:t>
       </w:r>
     </w:p>
     <w:p>
@@ -4642,7 +4698,7 @@
           <w:sz w:val="22"/>
           <w:szCs w:val="22"/>
         </w:rPr>
-        <w:t xml:space="preserve">The approvals screen (at /) lists staged consequential actions with diff previews, approval buttons, and drop controls. A spaces gallery (at /spaces) lets users browse and search agent-published dashboards and micro-apps. The routines screen manages schedules and manual run triggers, while the runs tab provides glass-box telemetry for prompt timing, token counts, cache hit rates, and delivered text. Additional views report token costs, project documentation, and integration health checks.</w:t>
+        <w:t xml:space="preserve">The approvals screen (at /) lists staged consequential actions with payload previews, approval buttons, and drop controls. A spaces gallery (at /spaces) lets users browse and search agent-published dashboards and micro-apps. The routines screen manages schedules and manual run triggers, while the runs tab provides glass-box telemetry for prompt timing, token counts, cache hit rates, and delivered text. Additional views report token costs, project documentation, and integration health checks.</w:t>
       </w:r>
     </w:p>
     <w:p>
@@ -4676,7 +4732,7 @@
           <w:sz w:val="26"/>
           <w:szCs w:val="26"/>
         </w:rPr>
-        <w:t xml:space="preserve">Current Production State (v5.0.0)</w:t>
+        <w:t xml:space="preserve">Showcase Implementation (v5.0.0)</w:t>
       </w:r>
     </w:p>
     <w:p>
@@ -4694,7 +4750,7 @@
           <w:sz w:val="22"/>
           <w:szCs w:val="22"/>
         </w:rPr>
-        <w:t xml:space="preserve">The core agent, deterministic governance pipeline, dual-engine document rendering (DOCX and visual HTML/SVG PDFs), and all 74 native tools are in production, backed by 44 test suites with 390 passing unit and integration tests.</w:t>
+        <w:t xml:space="preserve">The showcase includes the core agent, governance pipeline, dual-engine document rendering, native integrations, dynamically registered integrations, and an automated offline test suite.</w:t>
       </w:r>
     </w:p>
     <w:p>

</xml_diff>

<commit_message>
docs: curate the public showcase
</commit_message>
<xml_diff>
--- a/docs/Ellie_v5_Architecture_Specification.docx
+++ b/docs/Ellie_v5_Architecture_Specification.docx
@@ -201,7 +201,7 @@
           <w:sz w:val="22"/>
           <w:szCs w:val="22"/>
         </w:rPr>
-        <w:t xml:space="preserve">This architecture specification documents Ellie v5, a private, single-tenant, Slack-first AI Chief of Staff. The system was designed and built following production experience with commercial AI coworker platforms (specifically Viktor.com).</w:t>
+        <w:t xml:space="preserve">This architecture specification documents Ellie v5, a single-tenant, Slack-first AI Chief of Staff reference implementation.</w:t>
       </w:r>
     </w:p>
     <w:p>
@@ -434,7 +434,7 @@
           <w:sz w:val="22"/>
           <w:szCs w:val="22"/>
         </w:rPr>
-        <w:t xml:space="preserve">In multi-tenant managed setups, over 90% of credits end up consumed by idle polling loops and conversational ping-pongs, not deep reasoning.</w:t>
+        <w:t xml:space="preserve">Multi-tenant managed agents often spend substantial capacity on idle checks and conversational turns instead of bounded reasoning.</w:t>
       </w:r>
     </w:p>
     <w:p>
@@ -596,7 +596,7 @@
           <w:sz w:val="22"/>
           <w:szCs w:val="22"/>
         </w:rPr>
-        <w:t xml:space="preserve">Over time, an agent reading past documents or email threads begins treating its own prior drafts as ground-truth evidence, compounding hallucinations over successive cycles. Every resource generated by the agent is logged in an authored resources registry. When reading Google Docs, Drive files, or stored results, any artifact authored by the agent is marked as non-evidence, cutting off self-referential hallucination loops.</w:t>
+        <w:t xml:space="preserve">Over time, an agent reading past documents or email threads begins treating its own prior drafts as ground-truth evidence, compounding hallucinations over successive cycles. Tools with authored-resource tracking log generated Docs and Drive files. Declared reads of those resources, plus stored results, are marked as non-evidence, reducing self-referential hallucination loops.</w:t>
       </w:r>
     </w:p>
     <w:p>
@@ -4556,7 +4556,7 @@
           <w:sz w:val="22"/>
           <w:szCs w:val="22"/>
         </w:rPr>
-        <w:t xml:space="preserve">Gmail and Proton sentinels watch incoming correspondence around the clock. When a counterparty replies to an outstanding thread, open waiting loops resolve automatically. Inbound triage runs on the fast sentinel tier and posts Slack cards with one-click reply drafts.</w:t>
+        <w:t xml:space="preserve">Gmail and Proton sentinels periodically check incoming correspondence. When a counterparty replies to an outstanding thread, matching waiting loops can resolve automatically. Inbound triage runs on the fast sentinel tier and can stage reply drafts for owner review.</w:t>
       </w:r>
     </w:p>
     <w:p>
@@ -4574,7 +4574,7 @@
           <w:sz w:val="22"/>
           <w:szCs w:val="22"/>
         </w:rPr>
-        <w:t xml:space="preserve">A calendar sentinel checks upcoming schedules within a rolling 45-minute window, raising alerts only for imminent commitments or double bookings.</w:t>
+        <w:t xml:space="preserve">A calendar sentinel checks events starting within approximately 20 minutes, raising deduplicated alerts for imminent commitments.</w:t>
       </w:r>
     </w:p>
     <w:p>
@@ -4645,7 +4645,7 @@
           <w:sz w:val="22"/>
           <w:szCs w:val="22"/>
         </w:rPr>
-        <w:t xml:space="preserve">When a routine has hard factual constraints, an optional evaluator pass checks the draft against tool evidence using the reasoning model and appends a note when a violation is detected.</w:t>
+        <w:t xml:space="preserve">When a routine has hard factual constraints and an evaluator model, an optional evaluator pass checks the draft against tool evidence and appends a note when a violation is detected. Evaluator failures do not block delivery.</w:t>
       </w:r>
     </w:p>
     <w:p>
@@ -4767,7 +4767,7 @@
           <w:sz w:val="26"/>
           <w:szCs w:val="26"/>
         </w:rPr>
-        <w:t xml:space="preserve">Roadmap and Active Development (TBD)</w:t>
+        <w:t xml:space="preserve">Experimental Interfaces</w:t>
       </w:r>
     </w:p>
     <w:p>
@@ -4785,7 +4785,7 @@
           <w:sz w:val="22"/>
           <w:szCs w:val="22"/>
         </w:rPr>
-        <w:t xml:space="preserve">Mobile operations and real-time voice are currently in development. This track includes a native Android companion app (Jetpack Compose) for on-the-go approvals and space viewing, alongside bidirectional Gemini Live voice streaming over WebSockets and ambient meeting note synthesis.</w:t>
+        <w:t xml:space="preserve">The repository includes an experimental native Android companion (Jetpack Compose) for approvals, runs, routines, Spaces, voice notes, and meeting recording, along with server endpoints for audio transcription, speech synthesis, and meeting-note ingestion. These paths are showcase quality, not distributed production clients.</w:t>
       </w:r>
     </w:p>
     <w:sectPr>

</xml_diff>

<commit_message>
docs: curate the public showcase (#2)
</commit_message>
<xml_diff>
--- a/docs/Ellie_v5_Architecture_Specification.docx
+++ b/docs/Ellie_v5_Architecture_Specification.docx
@@ -201,7 +201,7 @@
           <w:sz w:val="22"/>
           <w:szCs w:val="22"/>
         </w:rPr>
-        <w:t xml:space="preserve">This architecture specification documents Ellie v5, a private, single-tenant, Slack-first AI Chief of Staff. The system was designed and built following production experience with commercial AI coworker platforms (specifically Viktor.com).</w:t>
+        <w:t xml:space="preserve">This architecture specification documents Ellie v5, a single-tenant, Slack-first AI Chief of Staff reference implementation.</w:t>
       </w:r>
     </w:p>
     <w:p>
@@ -434,7 +434,7 @@
           <w:sz w:val="22"/>
           <w:szCs w:val="22"/>
         </w:rPr>
-        <w:t xml:space="preserve">In multi-tenant managed setups, over 90% of credits end up consumed by idle polling loops and conversational ping-pongs, not deep reasoning.</w:t>
+        <w:t xml:space="preserve">Multi-tenant managed agents often spend substantial capacity on idle checks and conversational turns instead of bounded reasoning.</w:t>
       </w:r>
     </w:p>
     <w:p>
@@ -596,7 +596,7 @@
           <w:sz w:val="22"/>
           <w:szCs w:val="22"/>
         </w:rPr>
-        <w:t xml:space="preserve">Over time, an agent reading past documents or email threads begins treating its own prior drafts as ground-truth evidence, compounding hallucinations over successive cycles. Every resource generated by the agent is logged in an authored resources registry. When reading Google Docs, Drive files, or stored results, any artifact authored by the agent is marked as non-evidence, cutting off self-referential hallucination loops.</w:t>
+        <w:t xml:space="preserve">Over time, an agent reading past documents or email threads begins treating its own prior drafts as ground-truth evidence, compounding hallucinations over successive cycles. Tools with authored-resource tracking log generated Docs and Drive files. Declared reads of those resources, plus stored results, are marked as non-evidence, reducing self-referential hallucination loops.</w:t>
       </w:r>
     </w:p>
     <w:p>
@@ -4556,7 +4556,7 @@
           <w:sz w:val="22"/>
           <w:szCs w:val="22"/>
         </w:rPr>
-        <w:t xml:space="preserve">Gmail and Proton sentinels watch incoming correspondence around the clock. When a counterparty replies to an outstanding thread, open waiting loops resolve automatically. Inbound triage runs on the fast sentinel tier and posts Slack cards with one-click reply drafts.</w:t>
+        <w:t xml:space="preserve">Gmail and Proton sentinels periodically check incoming correspondence. When a counterparty replies to an outstanding thread, matching waiting loops can resolve automatically. Inbound triage runs on the fast sentinel tier and can stage reply drafts for owner review.</w:t>
       </w:r>
     </w:p>
     <w:p>
@@ -4574,7 +4574,7 @@
           <w:sz w:val="22"/>
           <w:szCs w:val="22"/>
         </w:rPr>
-        <w:t xml:space="preserve">A calendar sentinel checks upcoming schedules within a rolling 45-minute window, raising alerts only for imminent commitments or double bookings.</w:t>
+        <w:t xml:space="preserve">A calendar sentinel checks events starting within approximately 20 minutes, raising deduplicated alerts for imminent commitments.</w:t>
       </w:r>
     </w:p>
     <w:p>
@@ -4645,7 +4645,7 @@
           <w:sz w:val="22"/>
           <w:szCs w:val="22"/>
         </w:rPr>
-        <w:t xml:space="preserve">When a routine has hard factual constraints, an optional evaluator pass checks the draft against tool evidence using the reasoning model and appends a note when a violation is detected.</w:t>
+        <w:t xml:space="preserve">When a routine has hard factual constraints and an evaluator model, an optional evaluator pass checks the draft against tool evidence and appends a note when a violation is detected. Evaluator failures do not block delivery.</w:t>
       </w:r>
     </w:p>
     <w:p>
@@ -4767,7 +4767,7 @@
           <w:sz w:val="26"/>
           <w:szCs w:val="26"/>
         </w:rPr>
-        <w:t xml:space="preserve">Roadmap and Active Development (TBD)</w:t>
+        <w:t xml:space="preserve">Experimental Interfaces</w:t>
       </w:r>
     </w:p>
     <w:p>
@@ -4785,7 +4785,7 @@
           <w:sz w:val="22"/>
           <w:szCs w:val="22"/>
         </w:rPr>
-        <w:t xml:space="preserve">Mobile operations and real-time voice are currently in development. This track includes a native Android companion app (Jetpack Compose) for on-the-go approvals and space viewing, alongside bidirectional Gemini Live voice streaming over WebSockets and ambient meeting note synthesis.</w:t>
+        <w:t xml:space="preserve">The repository includes an experimental native Android companion (Jetpack Compose) for approvals, runs, routines, Spaces, voice notes, and meeting recording, along with server endpoints for audio transcription, speech synthesis, and meeting-note ingestion. These paths are showcase quality, not distributed production clients.</w:t>
       </w:r>
     </w:p>
     <w:sectPr>

</xml_diff>